<commit_message>
Embed internship certificate scan and correct STT references
- INTERNSHIP CERTIFICATE page now carries the uploaded scan
  (Internship Certificate.png) instead of a placeholder box
- week 8, section 2.3.7, executive summary, learning outcomes and the
  direct tax application section now refer to Securities Transaction Tax
  (STT), which was the actual work, alongside the Statement of Total Income
</commit_message>
<xml_diff>
--- a/Lingesh K - SIP Report 2026.docx
+++ b/Lingesh K - SIP Report 2026.docx
@@ -368,71 +368,49 @@
         <w:spacing w:before="0" w:after="0" w:line="360" w:lineRule="auto"/>
       </w:pPr>
     </w:p>
-    <w:tbl>
-      <w:tblPr>
-        <w:tblStyle w:val="TableGrid"/>
-        <w:tblW w:w="8666" w:type="dxa"/>
-        <w:jc w:val="left"/>
-        <w:tblBorders>
-          <w:top w:val="single" w:sz="6" w:space="0" w:color="000000"/>
-          <w:left w:val="single" w:sz="6" w:space="0" w:color="000000"/>
-          <w:bottom w:val="single" w:sz="6" w:space="0" w:color="000000"/>
-          <w:right w:val="single" w:sz="6" w:space="0" w:color="000000"/>
-          <w:insideH w:val="single" w:sz="6" w:space="0" w:color="000000"/>
-          <w:insideV w:val="single" w:sz="6" w:space="0" w:color="000000"/>
-        </w:tblBorders>
-        <w:tblLayout w:type="fixed"/>
-        <w:tblCellMar>
-          <w:top w:w="60" w:type="dxa"/>
-          <w:left w:w="108" w:type="dxa"/>
-          <w:bottom w:w="60" w:type="dxa"/>
-          <w:right w:w="108" w:type="dxa"/>
-        </w:tblCellMar>
-      </w:tblPr>
-      <w:tblGrid>
-        <w:gridCol w:w="8666"/>
-      </w:tblGrid>
-      <w:tr>
-        <w:trPr>
-          <w:cantSplit/>
-        </w:trPr>
-        <w:tc>
-          <w:tcPr>
-            <w:tcW w:w="8666" w:type="dxa"/>
-            <w:vAlign w:val="center"/>
-          </w:tcPr>
-          <w:p>
-            <w:pPr>
-              <w:spacing w:before="20" w:after="20" w:line="240" w:lineRule="auto"/>
-              <w:jc w:val="left"/>
-            </w:pPr>
-            <w:r>
-              <w:rPr>
-                <w:sz w:val="22"/>
-                <w:szCs w:val="22"/>
-              </w:rPr>
-              <w:br/>
-              <w:br/>
-              <w:br/>
-              <w:br/>
-              <w:br/>
-              <w:br/>
-              <w:br/>
-              <w:br/>
-              <w:t xml:space="preserve">[  Scanned copy of the Internship Completion Certificate issued by S. Ravi &amp; Associates, Chartered Accountants, dated 17 July 2026, to be inserted here.  ]</w:t>
-              <w:br/>
-              <w:br/>
-              <w:br/>
-              <w:br/>
-              <w:br/>
-              <w:br/>
-              <w:br/>
-              <w:br/>
-            </w:r>
-          </w:p>
-        </w:tc>
-      </w:tr>
-    </w:tbl>
+    <w:p>
+      <w:pPr>
+        <w:spacing w:before="0" w:after="0" w:line="240" w:lineRule="auto"/>
+        <w:jc w:val="center"/>
+      </w:pPr>
+      <w:r>
+        <w:drawing>
+          <wp:inline distT="0" distB="0" distL="0" distR="0">
+            <wp:extent cx="5502910" cy="7337213"/>
+            <wp:effectExtent l="0" t="0" r="0" b="0"/>
+            <wp:docPr id="21694" name="Internship Completion Certificate"/>
+            <wp:cNvGraphicFramePr>
+              <a:graphicFrameLocks xmlns:a="http://schemas.openxmlformats.org/drawingml/2006/main" noChangeAspect="1"/>
+            </wp:cNvGraphicFramePr>
+            <a:graphic xmlns:a="http://schemas.openxmlformats.org/drawingml/2006/main">
+              <a:graphicData uri="http://schemas.openxmlformats.org/drawingml/2006/picture">
+                <pic:pic xmlns:pic="http://schemas.openxmlformats.org/drawingml/2006/picture">
+                  <pic:nvPicPr>
+                    <pic:cNvPr id="0" name="Internship Completion Certificate"/>
+                    <pic:cNvPicPr/>
+                  </pic:nvPicPr>
+                  <pic:blipFill>
+                    <a:blip r:embed="rIdImg1"/>
+                    <a:stretch>
+                      <a:fillRect/>
+                    </a:stretch>
+                  </pic:blipFill>
+                  <pic:spPr>
+                    <a:xfrm>
+                      <a:off x="0" y="0"/>
+                      <a:ext cx="5502910" cy="7337213"/>
+                    </a:xfrm>
+                    <a:prstGeom prst="rect">
+                      <a:avLst/>
+                    </a:prstGeom>
+                  </pic:spPr>
+                </pic:pic>
+              </a:graphicData>
+            </a:graphic>
+          </wp:inline>
+        </w:drawing>
+      </w:r>
+    </w:p>
     <w:p>
       <w:pPr>
         <w:spacing w:before="0" w:after="0" w:line="240" w:lineRule="auto"/>
@@ -731,7 +709,7 @@
         <w:jc w:val="both"/>
       </w:pPr>
       <w:r>
-        <w:t xml:space="preserve">The final phase brought all of this together into the preparation of the Statement of Total Income. Using the bank account abstract, the Tally data and the reconciled Form 26AS credits, I computed total income for individual and corporate clients in Winman, verified taxes already paid against taxes payable, assisted in the preparation of balance sheets, and prepared returns for upload. In the last two weeks I independently completed the filing of three returns end to end, from data entry to upload, after review by my manager, and assisted in documentation for statutory audit assignments and in the reconciliation of books maintained in Tally with GST return filings.</w:t>
+        <w:t xml:space="preserve">The final phase brought all of this together into the preparation of the Statement of Total Income. I worked on Securities Transaction Tax and the related data entry in Winman, and then, using the bank account abstract, the Tally data and the reconciled Form 26AS credits, I computed total income for individual and corporate clients, verified taxes already paid against taxes payable, assisted in the preparation of balance sheets, and prepared returns for upload. In the last two weeks I independently completed the filing of three returns end to end, from data entry to upload, after review by my manager, and assisted in documentation for statutory audit assignments and in the reconciliation of books maintained in Tally with GST return filings.</w:t>
       </w:r>
     </w:p>
     <w:p>
@@ -4490,7 +4468,20 @@
           <w:sz w:val="24"/>
           <w:szCs w:val="24"/>
         </w:rPr>
-        <w:t xml:space="preserve">2.3.7  Bank Account Abstract and Statement of Total Income</w:t>
+        <w:t xml:space="preserve">2.3.7  Securities Transaction Tax, Bank Account Abstract and Statement of Total Income</w:t>
+      </w:r>
+    </w:p>
+    <w:p>
+      <w:pPr>
+        <w:numPr>
+          <w:ilvl w:val="0"/>
+          <w:numId w:val="1"/>
+        </w:numPr>
+        <w:spacing w:before="0" w:after="80" w:line="360" w:lineRule="auto"/>
+        <w:jc w:val="both"/>
+      </w:pPr>
+      <w:r>
+        <w:t xml:space="preserve">Worked on Securities Transaction Tax (STT): identified securities transactions from the Annual Information Statement and the broker-wise statements, verified the STT reflected against them and entered the details in Winman for the computation.</w:t>
       </w:r>
     </w:p>
     <w:p>
@@ -5081,7 +5072,20 @@
           <w:sz w:val="24"/>
           <w:szCs w:val="24"/>
         </w:rPr>
-        <w:t xml:space="preserve">Week 8 (29 June – 3 July 2026): Bank Abstract, Reconciliation and Computation</w:t>
+        <w:t xml:space="preserve">Week 8 (29 June – 3 July 2026): Securities Transaction Tax, Bank Abstract and Computation</w:t>
+      </w:r>
+    </w:p>
+    <w:p>
+      <w:pPr>
+        <w:numPr>
+          <w:ilvl w:val="0"/>
+          <w:numId w:val="1"/>
+        </w:numPr>
+        <w:spacing w:before="0" w:after="80" w:line="360" w:lineRule="auto"/>
+        <w:jc w:val="both"/>
+      </w:pPr>
+      <w:r>
+        <w:t xml:space="preserve">Worked on Securities Transaction Tax and the related data entry in Winman, tracing securities transactions and the STT against them from the Annual Information Statement and broker statements.</w:t>
       </w:r>
     </w:p>
     <w:p>
@@ -5577,6 +5581,19 @@
       </w:pPr>
       <w:r>
         <w:t xml:space="preserve">Applied the concepts of advance tax, self-assessment tax and credit for taxes paid while arriving at the net tax payable or refundable.</w:t>
+      </w:r>
+    </w:p>
+    <w:p>
+      <w:pPr>
+        <w:numPr>
+          <w:ilvl w:val="0"/>
+          <w:numId w:val="1"/>
+        </w:numPr>
+        <w:spacing w:before="0" w:after="80" w:line="360" w:lineRule="auto"/>
+        <w:jc w:val="both"/>
+      </w:pPr>
+      <w:r>
+        <w:t xml:space="preserve">Applied the taxation of securities transactions, including Securities Transaction Tax, while working on client data drawn from the Annual Information Statement and broker statements.</w:t>
       </w:r>
     </w:p>
     <w:p>
@@ -6556,6 +6573,25 @@
         <w:rPr>
           <w:b/>
         </w:rPr>
+        <w:t xml:space="preserve">Securities Transaction Tax:</w:t>
+      </w:r>
+      <w:r>
+        <w:t xml:space="preserve"> exposure to STT and to the treatment of securities transactions, including tracing them from the Annual Information Statement and broker statements into the computation.</w:t>
+      </w:r>
+    </w:p>
+    <w:p>
+      <w:pPr>
+        <w:numPr>
+          <w:ilvl w:val="0"/>
+          <w:numId w:val="1"/>
+        </w:numPr>
+        <w:spacing w:before="0" w:after="80" w:line="360" w:lineRule="auto"/>
+        <w:jc w:val="both"/>
+      </w:pPr>
+      <w:r>
+        <w:rPr>
+          <w:b/>
+        </w:rPr>
         <w:t xml:space="preserve">Income tax return filing:</w:t>
       </w:r>
       <w:r>
@@ -7183,7 +7219,7 @@
         <w:jc w:val="both"/>
       </w:pPr>
       <w:r>
-        <w:t xml:space="preserve">The closing weeks brought the strands together. Using bank account abstracts, Tally data and reconciled Form 26AS credits, I computed the Statement of Total Income for individual and corporate clients in Winman, assisted in the preparation of balance sheets, verified taxes paid against taxes payable, and prepared returns for upload. I independently completed three filings end to end after review, assisted in documentation for statutory audit assignments, and reconciled Form 26AS, AIS and TIS with the books of account as part of audit and income tax verification procedures. The client reports I prepared were verified and approved by my Manager.</w:t>
+        <w:t xml:space="preserve">The closing weeks brought the strands together. I worked on Securities Transaction Tax and the related data entry in Winman, and then, using bank account abstracts, Tally data and reconciled Form 26AS credits, computed the Statement of Total Income for individual and corporate clients in Winman, assisted in the preparation of balance sheets, verified taxes paid against taxes payable, and prepared returns for upload. I independently completed three filings end to end after review, assisted in documentation for statutory audit assignments, and reconciled Form 26AS, AIS and TIS with the books of account as part of audit and income tax verification procedures. The client reports I prepared were verified and approved by my Manager.</w:t>
       </w:r>
     </w:p>
     <w:p>

</xml_diff>

<commit_message>
Add title page logo and verify page layout and prose
- MUST + ISSM Business School banner on the title page, extracted from the
  reference report so it is the same artwork, 6.02in wide, placed between
  the register number and the college name as in the reference
- retuned title page, certificate and internship certificate spacing so
  every front matter page fits its intended page
- build_report.py now models block heights in inches and reports how full
  each front matter page is, flagging spills and near-empty pages
- verify_docx.py reports image sizes, alignment distribution and
  keep-with-next coverage
- new lint_text.py: checks spacing, punctuation, repeated words and
  over-long sentences across all 11,587 words (currently clean)
</commit_message>
<xml_diff>
--- a/Lingesh K - SIP Report 2026.docx
+++ b/Lingesh K - SIP Report 2026.docx
@@ -9,6 +9,11 @@
     </w:p>
     <w:p>
       <w:pPr>
+        <w:spacing w:before="0" w:after="0" w:line="360" w:lineRule="auto"/>
+      </w:pPr>
+    </w:p>
+    <w:p>
+      <w:pPr>
         <w:spacing w:before="0" w:after="200" w:line="360" w:lineRule="auto"/>
         <w:jc w:val="center"/>
       </w:pPr>
@@ -47,6 +52,11 @@
     </w:p>
     <w:p>
       <w:pPr>
+        <w:spacing w:before="0" w:after="0" w:line="360" w:lineRule="auto"/>
+      </w:pPr>
+    </w:p>
+    <w:p>
+      <w:pPr>
         <w:spacing w:before="0" w:after="40" w:line="360" w:lineRule="auto"/>
         <w:jc w:val="center"/>
       </w:pPr>
@@ -69,6 +79,11 @@
     </w:p>
     <w:p>
       <w:pPr>
+        <w:spacing w:before="0" w:after="0" w:line="360" w:lineRule="auto"/>
+      </w:pPr>
+    </w:p>
+    <w:p>
+      <w:pPr>
         <w:spacing w:before="0" w:after="40" w:line="360" w:lineRule="auto"/>
         <w:jc w:val="center"/>
       </w:pPr>
@@ -125,6 +140,54 @@
     </w:p>
     <w:p>
       <w:pPr>
+        <w:spacing w:before="0" w:after="0" w:line="240" w:lineRule="auto"/>
+        <w:jc w:val="center"/>
+      </w:pPr>
+      <w:r>
+        <w:drawing>
+          <wp:inline distT="0" distB="0" distL="0" distR="0">
+            <wp:extent cx="5502910" cy="1157773"/>
+            <wp:effectExtent l="0" t="0" r="0" b="0"/>
+            <wp:docPr id="1651" name="MUST and ISSM Business School logo"/>
+            <wp:cNvGraphicFramePr>
+              <a:graphicFrameLocks xmlns:a="http://schemas.openxmlformats.org/drawingml/2006/main" noChangeAspect="1"/>
+            </wp:cNvGraphicFramePr>
+            <a:graphic xmlns:a="http://schemas.openxmlformats.org/drawingml/2006/main">
+              <a:graphicData uri="http://schemas.openxmlformats.org/drawingml/2006/picture">
+                <pic:pic xmlns:pic="http://schemas.openxmlformats.org/drawingml/2006/picture">
+                  <pic:nvPicPr>
+                    <pic:cNvPr id="0" name="MUST and ISSM Business School logo"/>
+                    <pic:cNvPicPr/>
+                  </pic:nvPicPr>
+                  <pic:blipFill>
+                    <a:blip r:embed="rIdImg1"/>
+                    <a:stretch>
+                      <a:fillRect/>
+                    </a:stretch>
+                  </pic:blipFill>
+                  <pic:spPr>
+                    <a:xfrm>
+                      <a:off x="0" y="0"/>
+                      <a:ext cx="5502910" cy="1157773"/>
+                    </a:xfrm>
+                    <a:prstGeom prst="rect">
+                      <a:avLst/>
+                    </a:prstGeom>
+                  </pic:spPr>
+                </pic:pic>
+              </a:graphicData>
+            </a:graphic>
+          </wp:inline>
+        </w:drawing>
+      </w:r>
+    </w:p>
+    <w:p>
+      <w:pPr>
+        <w:spacing w:before="0" w:after="0" w:line="360" w:lineRule="auto"/>
+      </w:pPr>
+    </w:p>
+    <w:p>
+      <w:pPr>
         <w:spacing w:before="0" w:after="0" w:line="360" w:lineRule="auto"/>
       </w:pPr>
     </w:p>
@@ -271,22 +334,12 @@
     </w:p>
     <w:p>
       <w:pPr>
-        <w:spacing w:before="0" w:after="0" w:line="360" w:lineRule="auto"/>
-      </w:pPr>
-    </w:p>
-    <w:p>
-      <w:pPr>
         <w:spacing w:before="0" w:after="140" w:line="360" w:lineRule="auto"/>
         <w:jc w:val="both"/>
       </w:pPr>
       <w:r>
         <w:t xml:space="preserve">Viva Voce Examination Conducted on:</w:t>
       </w:r>
-    </w:p>
-    <w:p>
-      <w:pPr>
-        <w:spacing w:before="0" w:after="0" w:line="360" w:lineRule="auto"/>
-      </w:pPr>
     </w:p>
     <w:p>
       <w:pPr>
@@ -341,11 +394,6 @@
     </w:p>
     <w:p>
       <w:pPr>
-        <w:spacing w:before="0" w:after="0" w:line="360" w:lineRule="auto"/>
-      </w:pPr>
-    </w:p>
-    <w:p>
-      <w:pPr>
         <w:spacing w:before="0" w:after="200" w:line="360" w:lineRule="auto"/>
         <w:jc w:val="center"/>
       </w:pPr>
@@ -357,11 +405,6 @@
         </w:rPr>
         <w:t xml:space="preserve">INTERNSHIP CERTIFICATE</w:t>
       </w:r>
-    </w:p>
-    <w:p>
-      <w:pPr>
-        <w:spacing w:before="0" w:after="0" w:line="360" w:lineRule="auto"/>
-      </w:pPr>
     </w:p>
     <w:p>
       <w:pPr>
@@ -378,7 +421,7 @@
           <wp:inline distT="0" distB="0" distL="0" distR="0">
             <wp:extent cx="5502910" cy="7337213"/>
             <wp:effectExtent l="0" t="0" r="0" b="0"/>
-            <wp:docPr id="21694" name="Internship Completion Certificate"/>
+            <wp:docPr id="69004" name="Internship Completion Certificate"/>
             <wp:cNvGraphicFramePr>
               <a:graphicFrameLocks xmlns:a="http://schemas.openxmlformats.org/drawingml/2006/main" noChangeAspect="1"/>
             </wp:cNvGraphicFramePr>
@@ -390,7 +433,7 @@
                     <pic:cNvPicPr/>
                   </pic:nvPicPr>
                   <pic:blipFill>
-                    <a:blip r:embed="rIdImg1"/>
+                    <a:blip r:embed="rIdImg2"/>
                     <a:stretch>
                       <a:fillRect/>
                     </a:stretch>
@@ -920,7 +963,7 @@
                 <w:rPr>
                   <w:noProof/>
                 </w:rPr>
-                <w:t>11</w:t>
+                <w:t>10</w:t>
               </w:r>
             </w:fldSimple>
           </w:p>
@@ -983,7 +1026,7 @@
                 <w:rPr>
                   <w:noProof/>
                 </w:rPr>
-                <w:t>12</w:t>
+                <w:t>11</w:t>
               </w:r>
             </w:fldSimple>
             <w:r>
@@ -998,7 +1041,7 @@
                 <w:rPr>
                   <w:noProof/>
                 </w:rPr>
-                <w:t>25</w:t>
+                <w:t>23</w:t>
               </w:r>
             </w:fldSimple>
           </w:p>
@@ -1061,7 +1104,7 @@
                 <w:rPr>
                   <w:noProof/>
                 </w:rPr>
-                <w:t>26</w:t>
+                <w:t>24</w:t>
               </w:r>
             </w:fldSimple>
             <w:r>
@@ -1076,7 +1119,7 @@
                 <w:rPr>
                   <w:noProof/>
                 </w:rPr>
-                <w:t>31</w:t>
+                <w:t>28</w:t>
               </w:r>
             </w:fldSimple>
           </w:p>
@@ -1139,7 +1182,7 @@
                 <w:rPr>
                   <w:noProof/>
                 </w:rPr>
-                <w:t>32</w:t>
+                <w:t>29</w:t>
               </w:r>
             </w:fldSimple>
             <w:r>
@@ -1154,7 +1197,7 @@
                 <w:rPr>
                   <w:noProof/>
                 </w:rPr>
-                <w:t>37</w:t>
+                <w:t>33</w:t>
               </w:r>
             </w:fldSimple>
           </w:p>
@@ -1217,7 +1260,7 @@
                 <w:rPr>
                   <w:noProof/>
                 </w:rPr>
-                <w:t>38</w:t>
+                <w:t>34</w:t>
               </w:r>
             </w:fldSimple>
             <w:r>
@@ -1232,7 +1275,7 @@
                 <w:rPr>
                   <w:noProof/>
                 </w:rPr>
-                <w:t>42</w:t>
+                <w:t>38</w:t>
               </w:r>
             </w:fldSimple>
           </w:p>
@@ -1295,7 +1338,7 @@
                 <w:rPr>
                   <w:noProof/>
                 </w:rPr>
-                <w:t>43</w:t>
+                <w:t>39</w:t>
               </w:r>
             </w:fldSimple>
             <w:r>
@@ -1310,7 +1353,7 @@
                 <w:rPr>
                   <w:noProof/>
                 </w:rPr>
-                <w:t>45</w:t>
+                <w:t>41</w:t>
               </w:r>
             </w:fldSimple>
           </w:p>

</xml_diff>

<commit_message>
Match the two-line running header used by the sample reports
Compared against Final SIP KYR.pdf (Kottavalasa Yogeswar Rao, OSI2509027).
Both that report and Aarti Chettiar's use a three-line running header:
'CHAPTER n' over the chapter title on the left, 'SUMMER INTERNSHIP' over
'PROJECT' on the right, page number underneath. Ours used a single piped
line, so docx_writer now accepts multi-line header blocks and the chapter
headers were converted to the sample layout.
</commit_message>
<xml_diff>
--- a/Lingesh K - SIP Report 2026.docx
+++ b/Lingesh K - SIP Report 2026.docx
@@ -148,7 +148,7 @@
           <wp:inline distT="0" distB="0" distL="0" distR="0">
             <wp:extent cx="5502910" cy="1157773"/>
             <wp:effectExtent l="0" t="0" r="0" b="0"/>
-            <wp:docPr id="1651" name="MUST and ISSM Business School logo"/>
+            <wp:docPr id="86248" name="MUST and ISSM Business School logo"/>
             <wp:cNvGraphicFramePr>
               <a:graphicFrameLocks xmlns:a="http://schemas.openxmlformats.org/drawingml/2006/main" noChangeAspect="1"/>
             </wp:cNvGraphicFramePr>
@@ -421,7 +421,7 @@
           <wp:inline distT="0" distB="0" distL="0" distR="0">
             <wp:extent cx="5502910" cy="7337213"/>
             <wp:effectExtent l="0" t="0" r="0" b="0"/>
-            <wp:docPr id="69004" name="Internship Completion Certificate"/>
+            <wp:docPr id="58821" name="Internship Completion Certificate"/>
             <wp:cNvGraphicFramePr>
               <a:graphicFrameLocks xmlns:a="http://schemas.openxmlformats.org/drawingml/2006/main" noChangeAspect="1"/>
             </wp:cNvGraphicFramePr>
@@ -7999,7 +7999,7 @@
         <w:sz w:val="20"/>
         <w:szCs w:val="20"/>
       </w:rPr>
-      <w:t xml:space="preserve">CHAPTER 1  |  INDUSTRY AND COMPANY OVERVIEW</w:t>
+      <w:t xml:space="preserve">CHAPTER 1</w:t>
     </w:r>
     <w:r>
       <w:tab/>
@@ -8010,7 +8010,35 @@
         <w:sz w:val="20"/>
         <w:szCs w:val="20"/>
       </w:rPr>
-      <w:t xml:space="preserve">SUMMER INTERNSHIP PROJECT</w:t>
+      <w:t xml:space="preserve">SUMMER INTERNSHIP</w:t>
+    </w:r>
+  </w:p>
+  <w:p>
+    <w:pPr>
+      <w:tabs>
+        <w:tab w:val="right" w:pos="8666"/>
+      </w:tabs>
+      <w:spacing w:before="0" w:after="0" w:line="240" w:lineRule="auto"/>
+      <w:jc w:val="left"/>
+    </w:pPr>
+    <w:r>
+      <w:rPr>
+        <w:b/>
+        <w:sz w:val="20"/>
+        <w:szCs w:val="20"/>
+      </w:rPr>
+      <w:t xml:space="preserve">INDUSTRY AND COMPANY OVERVIEW</w:t>
+    </w:r>
+    <w:r>
+      <w:tab/>
+    </w:r>
+    <w:r>
+      <w:rPr>
+        <w:b/>
+        <w:sz w:val="20"/>
+        <w:szCs w:val="20"/>
+      </w:rPr>
+      <w:t xml:space="preserve">PROJECT</w:t>
     </w:r>
   </w:p>
   <w:p>
@@ -8049,7 +8077,7 @@
         <w:sz w:val="20"/>
         <w:szCs w:val="20"/>
       </w:rPr>
-      <w:t xml:space="preserve">CHAPTER 2  |  JOB / TASK DESCRIPTION</w:t>
+      <w:t xml:space="preserve">CHAPTER 2</w:t>
     </w:r>
     <w:r>
       <w:tab/>
@@ -8060,7 +8088,35 @@
         <w:sz w:val="20"/>
         <w:szCs w:val="20"/>
       </w:rPr>
-      <w:t xml:space="preserve">SUMMER INTERNSHIP PROJECT</w:t>
+      <w:t xml:space="preserve">SUMMER INTERNSHIP</w:t>
+    </w:r>
+  </w:p>
+  <w:p>
+    <w:pPr>
+      <w:tabs>
+        <w:tab w:val="right" w:pos="8666"/>
+      </w:tabs>
+      <w:spacing w:before="0" w:after="0" w:line="240" w:lineRule="auto"/>
+      <w:jc w:val="left"/>
+    </w:pPr>
+    <w:r>
+      <w:rPr>
+        <w:b/>
+        <w:sz w:val="20"/>
+        <w:szCs w:val="20"/>
+      </w:rPr>
+      <w:t xml:space="preserve">JOB / TASK DESCRIPTION</w:t>
+    </w:r>
+    <w:r>
+      <w:tab/>
+    </w:r>
+    <w:r>
+      <w:rPr>
+        <w:b/>
+        <w:sz w:val="20"/>
+        <w:szCs w:val="20"/>
+      </w:rPr>
+      <w:t xml:space="preserve">PROJECT</w:t>
     </w:r>
   </w:p>
   <w:p>
@@ -8099,7 +8155,7 @@
         <w:sz w:val="20"/>
         <w:szCs w:val="20"/>
       </w:rPr>
-      <w:t xml:space="preserve">CHAPTER 3  |  ANALYSIS OF JOB PERFORMANCE</w:t>
+      <w:t xml:space="preserve">CHAPTER 3</w:t>
     </w:r>
     <w:r>
       <w:tab/>
@@ -8110,7 +8166,35 @@
         <w:sz w:val="20"/>
         <w:szCs w:val="20"/>
       </w:rPr>
-      <w:t xml:space="preserve">SUMMER INTERNSHIP PROJECT</w:t>
+      <w:t xml:space="preserve">SUMMER INTERNSHIP</w:t>
+    </w:r>
+  </w:p>
+  <w:p>
+    <w:pPr>
+      <w:tabs>
+        <w:tab w:val="right" w:pos="8666"/>
+      </w:tabs>
+      <w:spacing w:before="0" w:after="0" w:line="240" w:lineRule="auto"/>
+      <w:jc w:val="left"/>
+    </w:pPr>
+    <w:r>
+      <w:rPr>
+        <w:b/>
+        <w:sz w:val="20"/>
+        <w:szCs w:val="20"/>
+      </w:rPr>
+      <w:t xml:space="preserve">ANALYSIS OF JOB PERFORMANCE</w:t>
+    </w:r>
+    <w:r>
+      <w:tab/>
+    </w:r>
+    <w:r>
+      <w:rPr>
+        <w:b/>
+        <w:sz w:val="20"/>
+        <w:szCs w:val="20"/>
+      </w:rPr>
+      <w:t xml:space="preserve">PROJECT</w:t>
     </w:r>
   </w:p>
   <w:p>
@@ -8149,7 +8233,7 @@
         <w:sz w:val="20"/>
         <w:szCs w:val="20"/>
       </w:rPr>
-      <w:t xml:space="preserve">CHAPTER 4  |  LEARNING OUTCOMES</w:t>
+      <w:t xml:space="preserve">CHAPTER 4</w:t>
     </w:r>
     <w:r>
       <w:tab/>
@@ -8160,7 +8244,35 @@
         <w:sz w:val="20"/>
         <w:szCs w:val="20"/>
       </w:rPr>
-      <w:t xml:space="preserve">SUMMER INTERNSHIP PROJECT</w:t>
+      <w:t xml:space="preserve">SUMMER INTERNSHIP</w:t>
+    </w:r>
+  </w:p>
+  <w:p>
+    <w:pPr>
+      <w:tabs>
+        <w:tab w:val="right" w:pos="8666"/>
+      </w:tabs>
+      <w:spacing w:before="0" w:after="0" w:line="240" w:lineRule="auto"/>
+      <w:jc w:val="left"/>
+    </w:pPr>
+    <w:r>
+      <w:rPr>
+        <w:b/>
+        <w:sz w:val="20"/>
+        <w:szCs w:val="20"/>
+      </w:rPr>
+      <w:t xml:space="preserve">LEARNING OUTCOMES</w:t>
+    </w:r>
+    <w:r>
+      <w:tab/>
+    </w:r>
+    <w:r>
+      <w:rPr>
+        <w:b/>
+        <w:sz w:val="20"/>
+        <w:szCs w:val="20"/>
+      </w:rPr>
+      <w:t xml:space="preserve">PROJECT</w:t>
     </w:r>
   </w:p>
   <w:p>
@@ -8199,7 +8311,7 @@
         <w:sz w:val="20"/>
         <w:szCs w:val="20"/>
       </w:rPr>
-      <w:t xml:space="preserve">CHAPTER 5  |  SUMMARY AND CONCLUSION</w:t>
+      <w:t xml:space="preserve">CHAPTER 5</w:t>
     </w:r>
     <w:r>
       <w:tab/>
@@ -8210,7 +8322,35 @@
         <w:sz w:val="20"/>
         <w:szCs w:val="20"/>
       </w:rPr>
-      <w:t xml:space="preserve">SUMMER INTERNSHIP PROJECT</w:t>
+      <w:t xml:space="preserve">SUMMER INTERNSHIP</w:t>
+    </w:r>
+  </w:p>
+  <w:p>
+    <w:pPr>
+      <w:tabs>
+        <w:tab w:val="right" w:pos="8666"/>
+      </w:tabs>
+      <w:spacing w:before="0" w:after="0" w:line="240" w:lineRule="auto"/>
+      <w:jc w:val="left"/>
+    </w:pPr>
+    <w:r>
+      <w:rPr>
+        <w:b/>
+        <w:sz w:val="20"/>
+        <w:szCs w:val="20"/>
+      </w:rPr>
+      <w:t xml:space="preserve">SUMMARY AND CONCLUSION</w:t>
+    </w:r>
+    <w:r>
+      <w:tab/>
+    </w:r>
+    <w:r>
+      <w:rPr>
+        <w:b/>
+        <w:sz w:val="20"/>
+        <w:szCs w:val="20"/>
+      </w:rPr>
+      <w:t xml:space="preserve">PROJECT</w:t>
     </w:r>
   </w:p>
   <w:p>
@@ -8260,7 +8400,34 @@
         <w:sz w:val="20"/>
         <w:szCs w:val="20"/>
       </w:rPr>
-      <w:t xml:space="preserve">SUMMER INTERNSHIP PROJECT</w:t>
+      <w:t xml:space="preserve">SUMMER INTERNSHIP</w:t>
+    </w:r>
+  </w:p>
+  <w:p>
+    <w:pPr>
+      <w:tabs>
+        <w:tab w:val="right" w:pos="8666"/>
+      </w:tabs>
+      <w:spacing w:before="0" w:after="0" w:line="240" w:lineRule="auto"/>
+      <w:jc w:val="left"/>
+    </w:pPr>
+    <w:r>
+      <w:rPr>
+        <w:b/>
+        <w:sz w:val="20"/>
+        <w:szCs w:val="20"/>
+      </w:rPr>
+    </w:r>
+    <w:r>
+      <w:tab/>
+    </w:r>
+    <w:r>
+      <w:rPr>
+        <w:b/>
+        <w:sz w:val="20"/>
+        <w:szCs w:val="20"/>
+      </w:rPr>
+      <w:t xml:space="preserve">PROJECT</w:t>
     </w:r>
   </w:p>
   <w:p>

</xml_diff>

<commit_message>
Remove the personal-details blocks from README and the Markdown copy
The report itself contains no resume or CV. The only place personal details
were listed outside the report was a profile-style block at the top of
README.md (which GitHub renders on the repository home page) and a matching
header in SIP-Report-2026.md. Both are removed; the Markdown copy now starts
at the title page, exactly like the .docx.
</commit_message>
<xml_diff>
--- a/Lingesh K - SIP Report 2026.docx
+++ b/Lingesh K - SIP Report 2026.docx
@@ -148,7 +148,7 @@
           <wp:inline distT="0" distB="0" distL="0" distR="0">
             <wp:extent cx="5502910" cy="1157773"/>
             <wp:effectExtent l="0" t="0" r="0" b="0"/>
-            <wp:docPr id="86248" name="MUST and ISSM Business School logo"/>
+            <wp:docPr id="63421" name="MUST and ISSM Business School logo"/>
             <wp:cNvGraphicFramePr>
               <a:graphicFrameLocks xmlns:a="http://schemas.openxmlformats.org/drawingml/2006/main" noChangeAspect="1"/>
             </wp:cNvGraphicFramePr>
@@ -421,7 +421,7 @@
           <wp:inline distT="0" distB="0" distL="0" distR="0">
             <wp:extent cx="5502910" cy="7337213"/>
             <wp:effectExtent l="0" t="0" r="0" b="0"/>
-            <wp:docPr id="58821" name="Internship Completion Certificate"/>
+            <wp:docPr id="67082" name="Internship Completion Certificate"/>
             <wp:cNvGraphicFramePr>
               <a:graphicFrameLocks xmlns:a="http://schemas.openxmlformats.org/drawingml/2006/main" noChangeAspect="1"/>
             </wp:cNvGraphicFramePr>

</xml_diff>

<commit_message>
Leave the INTERNSHIP CERTIFICATE page as heading only
The scanned certificate is no longer printed on page 3; that page now
carries just the heading, the same as Aarti Chettiar's and Kottavalasa
Yogeswar Rao's reports, so the certificate can be attached as a separate
sheet. The scan stays in the repository, and setting EMBED_CERTIFICATE to
True in tools/report_content.py puts it back on the page.
</commit_message>
<xml_diff>
--- a/Lingesh K - SIP Report 2026.docx
+++ b/Lingesh K - SIP Report 2026.docx
@@ -148,7 +148,7 @@
           <wp:inline distT="0" distB="0" distL="0" distR="0">
             <wp:extent cx="5502910" cy="1157773"/>
             <wp:effectExtent l="0" t="0" r="0" b="0"/>
-            <wp:docPr id="63421" name="MUST and ISSM Business School logo"/>
+            <wp:docPr id="7780" name="MUST and ISSM Business School logo"/>
             <wp:cNvGraphicFramePr>
               <a:graphicFrameLocks xmlns:a="http://schemas.openxmlformats.org/drawingml/2006/main" noChangeAspect="1"/>
             </wp:cNvGraphicFramePr>
@@ -404,54 +404,6 @@
           <w:szCs w:val="32"/>
         </w:rPr>
         <w:t xml:space="preserve">INTERNSHIP CERTIFICATE</w:t>
-      </w:r>
-    </w:p>
-    <w:p>
-      <w:pPr>
-        <w:spacing w:before="0" w:after="0" w:line="360" w:lineRule="auto"/>
-      </w:pPr>
-    </w:p>
-    <w:p>
-      <w:pPr>
-        <w:spacing w:before="0" w:after="0" w:line="240" w:lineRule="auto"/>
-        <w:jc w:val="center"/>
-      </w:pPr>
-      <w:r>
-        <w:drawing>
-          <wp:inline distT="0" distB="0" distL="0" distR="0">
-            <wp:extent cx="5502910" cy="7337213"/>
-            <wp:effectExtent l="0" t="0" r="0" b="0"/>
-            <wp:docPr id="67082" name="Internship Completion Certificate"/>
-            <wp:cNvGraphicFramePr>
-              <a:graphicFrameLocks xmlns:a="http://schemas.openxmlformats.org/drawingml/2006/main" noChangeAspect="1"/>
-            </wp:cNvGraphicFramePr>
-            <a:graphic xmlns:a="http://schemas.openxmlformats.org/drawingml/2006/main">
-              <a:graphicData uri="http://schemas.openxmlformats.org/drawingml/2006/picture">
-                <pic:pic xmlns:pic="http://schemas.openxmlformats.org/drawingml/2006/picture">
-                  <pic:nvPicPr>
-                    <pic:cNvPr id="0" name="Internship Completion Certificate"/>
-                    <pic:cNvPicPr/>
-                  </pic:nvPicPr>
-                  <pic:blipFill>
-                    <a:blip r:embed="rIdImg2"/>
-                    <a:stretch>
-                      <a:fillRect/>
-                    </a:stretch>
-                  </pic:blipFill>
-                  <pic:spPr>
-                    <a:xfrm>
-                      <a:off x="0" y="0"/>
-                      <a:ext cx="5502910" cy="7337213"/>
-                    </a:xfrm>
-                    <a:prstGeom prst="rect">
-                      <a:avLst/>
-                    </a:prstGeom>
-                  </pic:spPr>
-                </pic:pic>
-              </a:graphicData>
-            </a:graphic>
-          </wp:inline>
-        </w:drawing>
       </w:r>
     </w:p>
     <w:p>

</xml_diff>

<commit_message>
Spell the Chairman's name as KATHIRVEL GANAPATHIAPPAN
Matches the spelling used in Final SIP KYR.pdf. The Academic Head stays as
Dr. Kavitha Manikandan.
</commit_message>
<xml_diff>
--- a/Lingesh K - SIP Report 2026.docx
+++ b/Lingesh K - SIP Report 2026.docx
@@ -156,7 +156,7 @@
           <wp:inline distT="0" distB="0" distL="0" distR="0">
             <wp:extent cx="5502910" cy="1157773"/>
             <wp:effectExtent l="0" t="0" r="0" b="0"/>
-            <wp:docPr id="52484" name="MUST and ISSM Business School logo"/>
+            <wp:docPr id="70110" name="MUST and ISSM Business School logo"/>
             <wp:cNvGraphicFramePr>
               <a:graphicFrameLocks xmlns:a="http://schemas.openxmlformats.org/drawingml/2006/main" noChangeAspect="1"/>
             </wp:cNvGraphicFramePr>
@@ -676,7 +676,7 @@
         <w:jc w:val="both"/>
       </w:pPr>
       <w:r>
-        <w:t xml:space="preserve">I would like to express my sincere gratitude to our respected Chairman, Mr. KATHIR VEL GANAPATHIAPPAN, for providing us with the valuable opportunity to carry out and complete this project.</w:t>
+        <w:t xml:space="preserve">I would like to express my sincere gratitude to our respected Chairman, Mr. KATHIRVEL GANAPATHIAPPAN, for providing us with the valuable opportunity to carry out and complete this project.</w:t>
       </w:r>
     </w:p>
     <w:p>

</xml_diff>

<commit_message>
Match the certificate and acknowledgement typography, and use Mrs.Kavitha Manikandan
Measured page 2, 4 and 5 of Final SIP KYR.pdf run by run:

  certificate signatory name    Dr. Kavitha Manikandan 12 pt plain
                                -> Mrs.Kavitha Manikandan 14 pt bold
  certificate 'Academic Head'   12 pt -> 14 pt plain
  examiner labels               plain -> bold
  acknowledgement chairman      plain -> bold
  acknowledgement academic head plain -> bold

'ISSM Business School' stays 12 pt plain, the founder's name stays plain and
the declaration footer stays plain, all as in the sample.

audit_fonts.py now covers 30 typographic elements; all three reports pass
30 of 30.
</commit_message>
<xml_diff>
--- a/Lingesh K - SIP Report 2026.docx
+++ b/Lingesh K - SIP Report 2026.docx
@@ -147,7 +147,7 @@
           <wp:inline distT="0" distB="0" distL="0" distR="0">
             <wp:extent cx="5502910" cy="1157773"/>
             <wp:effectExtent l="0" t="0" r="0" b="0"/>
-            <wp:docPr id="82278" name="MUST and ISSM Business School logo"/>
+            <wp:docPr id="82394" name="MUST and ISSM Business School logo"/>
             <wp:cNvGraphicFramePr>
               <a:graphicFrameLocks xmlns:a="http://schemas.openxmlformats.org/drawingml/2006/main" noChangeAspect="1"/>
             </wp:cNvGraphicFramePr>
@@ -304,15 +304,24 @@
         <w:jc w:val="both"/>
       </w:pPr>
       <w:r>
-        <w:t xml:space="preserve">Dr. Kavitha Manikandan</w:t>
-      </w:r>
-    </w:p>
-    <w:p>
-      <w:pPr>
-        <w:spacing w:before="0" w:after="140" w:line="360" w:lineRule="auto"/>
-        <w:jc w:val="both"/>
-      </w:pPr>
-      <w:r>
+        <w:rPr>
+          <w:b/>
+          <w:sz w:val="28"/>
+          <w:szCs w:val="28"/>
+        </w:rPr>
+        <w:t xml:space="preserve">Mrs.Kavitha Manikandan</w:t>
+      </w:r>
+    </w:p>
+    <w:p>
+      <w:pPr>
+        <w:spacing w:before="0" w:after="140" w:line="360" w:lineRule="auto"/>
+        <w:jc w:val="both"/>
+      </w:pPr>
+      <w:r>
+        <w:rPr>
+          <w:sz w:val="28"/>
+          <w:szCs w:val="28"/>
+        </w:rPr>
         <w:t xml:space="preserve">Academic Head</w:t>
       </w:r>
     </w:p>
@@ -373,12 +382,18 @@
         <w:jc w:val="left"/>
       </w:pPr>
       <w:r>
+        <w:rPr>
+          <w:b/>
+        </w:rPr>
         <w:t xml:space="preserve">Internal Examiner</w:t>
       </w:r>
       <w:r>
         <w:tab/>
       </w:r>
       <w:r>
+        <w:rPr>
+          <w:b/>
+        </w:rPr>
         <w:t xml:space="preserve">External Examiner</w:t>
       </w:r>
     </w:p>
@@ -671,7 +686,16 @@
         <w:jc w:val="both"/>
       </w:pPr>
       <w:r>
-        <w:t xml:space="preserve">I would like to express my sincere gratitude to our respected Chairman, Mr. KATHIRVEL GANAPATHIAPPAN, for providing us with the valuable opportunity to carry out and complete this project.</w:t>
+        <w:t xml:space="preserve">I would like to express my sincere gratitude to our respected Chairman, </w:t>
+      </w:r>
+      <w:r>
+        <w:rPr>
+          <w:b/>
+        </w:rPr>
+        <w:t xml:space="preserve">Mr. KATHIRVEL GANAPATHIAPPAN</w:t>
+      </w:r>
+      <w:r>
+        <w:t xml:space="preserve">, for providing us with the valuable opportunity to carry out and complete this project.</w:t>
       </w:r>
     </w:p>
     <w:p>
@@ -689,7 +713,16 @@
         <w:jc w:val="both"/>
       </w:pPr>
       <w:r>
-        <w:t xml:space="preserve">I am highly indebted to our Academic Head, Dr. KAVITHA MANIKANDAN, for her guidance and constant supervision, for providing the necessary information regarding the project and for her support in completing it.</w:t>
+        <w:t xml:space="preserve">I am highly indebted to our Academic Head, </w:t>
+      </w:r>
+      <w:r>
+        <w:rPr>
+          <w:b/>
+        </w:rPr>
+        <w:t xml:space="preserve">Dr. KAVITHA MANIKANDAN</w:t>
+      </w:r>
+      <w:r>
+        <w:t xml:space="preserve">, for her guidance and constant supervision, for providing the necessary information regarding the project and for her support in completing it.</w:t>
       </w:r>
     </w:p>
     <w:p>

</xml_diff>

<commit_message>
Use Mrs. for the Academic Head on the acknowledgement page as well
The certificate page already read Mrs.Kavitha Manikandan; the acknowledgement
now reads Mrs. KAVITHA MANIKANDAN in all three reports, so the title is
consistent throughout and matches the sample report, which uses Mrs. in both
places. No occurrence of Dr. Kavitha remains in any of the three documents.
</commit_message>
<xml_diff>
--- a/Lingesh K - SIP Report 2026.docx
+++ b/Lingesh K - SIP Report 2026.docx
@@ -147,7 +147,7 @@
           <wp:inline distT="0" distB="0" distL="0" distR="0">
             <wp:extent cx="5502910" cy="1157773"/>
             <wp:effectExtent l="0" t="0" r="0" b="0"/>
-            <wp:docPr id="82394" name="MUST and ISSM Business School logo"/>
+            <wp:docPr id="73129" name="MUST and ISSM Business School logo"/>
             <wp:cNvGraphicFramePr>
               <a:graphicFrameLocks xmlns:a="http://schemas.openxmlformats.org/drawingml/2006/main" noChangeAspect="1"/>
             </wp:cNvGraphicFramePr>
@@ -719,7 +719,7 @@
         <w:rPr>
           <w:b/>
         </w:rPr>
-        <w:t xml:space="preserve">Dr. KAVITHA MANIKANDAN</w:t>
+        <w:t xml:space="preserve">Mrs. KAVITHA MANIKANDAN</w:t>
       </w:r>
       <w:r>
         <w:t xml:space="preserve">, for her guidance and constant supervision, for providing the necessary information regarding the project and for her support in completing it.</w:t>

</xml_diff>